<commit_message>
Deploying to gh-pages from @ Morrison-Lab/rme@6d054345cb911b43adb5502c6950252a49b3252f 🚀
</commit_message>
<xml_diff>
--- a/chapters/intro-multilevel-models-handout.docx
+++ b/chapters/intro-multilevel-models-handout.docx
@@ -32563,7 +32563,7 @@
       </w:r>
     </w:p>
     <w:bookmarkEnd w:id="131"/>
-    <w:bookmarkStart w:id="150" w:name="further-reading"/>
+    <w:bookmarkStart w:id="154" w:name="further-reading"/>
     <w:p>
       <w:pPr>
         <w:pStyle w:val="Heading1"/>
@@ -33045,7 +33045,21 @@
         </w:numPr>
       </w:pPr>
       <w:r>
-        <w:t xml:space="preserve">Books:</w:t>
+        <w:t xml:space="preserve">Software for fitting multilevel models by</w:t>
+      </w:r>
+      <w:r>
+        <w:t xml:space="preserve"> </w:t>
+      </w:r>
+      <w:hyperlink r:id="rId87">
+        <w:r>
+          <w:rPr>
+            <w:rStyle w:val="Hyperlink"/>
+          </w:rPr>
+          <w:t xml:space="preserve">Bayesian inference</w:t>
+        </w:r>
+      </w:hyperlink>
+      <w:r>
+        <w:t xml:space="preserve">:</w:t>
       </w:r>
     </w:p>
     <w:p>
@@ -33056,13 +33070,161 @@
           <w:numId w:val="1016"/>
         </w:numPr>
       </w:pPr>
+      <w:hyperlink r:id="rId148">
+        <w:r>
+          <w:rPr>
+            <w:rStyle w:val="Hyperlink"/>
+          </w:rPr>
+          <w:t xml:space="preserve">Stan and JAGS compared</w:t>
+        </w:r>
+      </w:hyperlink>
+      <w:r>
+        <w:t xml:space="preserve">,</w:t>
+      </w:r>
+      <w:r>
+        <w:t xml:space="preserve"> </w:t>
+      </w:r>
+      <w:r>
+        <w:t xml:space="preserve">on the Bayesian examples page of the statistics notes</w:t>
+      </w:r>
+    </w:p>
+    <w:p>
+      <w:pPr>
+        <w:pStyle w:val="Compact"/>
+        <w:numPr>
+          <w:ilvl w:val="1"/>
+          <w:numId w:val="1016"/>
+        </w:numPr>
+      </w:pPr>
+      <w:hyperlink r:id="rId149">
+        <w:r>
+          <w:rPr>
+            <w:rStyle w:val="Hyperlink"/>
+          </w:rPr>
+          <w:t xml:space="preserve">Stan</w:t>
+        </w:r>
+      </w:hyperlink>
+      <w:r>
+        <w:t xml:space="preserve">, the sampler behind the</w:t>
+      </w:r>
+      <w:r>
+        <w:t xml:space="preserve"> </w:t>
+      </w:r>
+      <w:r>
+        <w:rPr>
+          <w:rStyle w:val="VerbatimChar"/>
+        </w:rPr>
+        <w:t xml:space="preserve">rstanarm</w:t>
+      </w:r>
+      <w:r>
+        <w:t xml:space="preserve"> </w:t>
+      </w:r>
+      <w:r>
+        <w:t xml:space="preserve">package used in this chapter</w:t>
+      </w:r>
+    </w:p>
+    <w:p>
+      <w:pPr>
+        <w:pStyle w:val="Compact"/>
+        <w:numPr>
+          <w:ilvl w:val="1"/>
+          <w:numId w:val="1016"/>
+        </w:numPr>
+      </w:pPr>
+      <w:hyperlink r:id="rId150">
+        <w:r>
+          <w:rPr>
+            <w:rStyle w:val="VerbatimChar"/>
+          </w:rPr>
+          <w:t xml:space="preserve">rstanarm</w:t>
+        </w:r>
+      </w:hyperlink>
+      <w:r>
+        <w:t xml:space="preserve">, which fits multilevel</w:t>
+      </w:r>
+      <w:r>
+        <w:t xml:space="preserve"> </w:t>
+      </w:r>
+      <w:hyperlink r:id="rId89">
+        <w:r>
+          <w:rPr>
+            <w:rStyle w:val="Hyperlink"/>
+          </w:rPr>
+          <w:t xml:space="preserve">regression models</w:t>
+        </w:r>
+      </w:hyperlink>
+      <w:r>
+        <w:t xml:space="preserve"> </w:t>
+      </w:r>
+      <w:r>
+        <w:t xml:space="preserve">with Stan</w:t>
+      </w:r>
+      <w:r>
+        <w:t xml:space="preserve"> </w:t>
+      </w:r>
+      <w:r>
+        <w:t xml:space="preserve">using</w:t>
+      </w:r>
+      <w:r>
+        <w:t xml:space="preserve"> </w:t>
+      </w:r>
+      <w:r>
+        <w:rPr>
+          <w:rStyle w:val="VerbatimChar"/>
+        </w:rPr>
+        <w:t xml:space="preserve">lme4</w:t>
+      </w:r>
+      <w:r>
+        <w:t xml:space="preserve">-style formulas</w:t>
+      </w:r>
+    </w:p>
+    <w:p>
+      <w:pPr>
+        <w:pStyle w:val="Compact"/>
+        <w:numPr>
+          <w:ilvl w:val="1"/>
+          <w:numId w:val="1016"/>
+        </w:numPr>
+      </w:pPr>
+      <w:hyperlink r:id="rId151">
+        <w:r>
+          <w:rPr>
+            <w:rStyle w:val="Hyperlink"/>
+          </w:rPr>
+          <w:t xml:space="preserve">JAGS</w:t>
+        </w:r>
+      </w:hyperlink>
+      <w:r>
+        <w:t xml:space="preserve">, which the statistics notes use for their Bayesian examples</w:t>
+      </w:r>
+    </w:p>
+    <w:p>
+      <w:pPr>
+        <w:pStyle w:val="Compact"/>
+        <w:numPr>
+          <w:ilvl w:val="0"/>
+          <w:numId w:val="1009"/>
+        </w:numPr>
+      </w:pPr>
+      <w:r>
+        <w:t xml:space="preserve">Books:</w:t>
+      </w:r>
+    </w:p>
+    <w:p>
+      <w:pPr>
+        <w:pStyle w:val="Compact"/>
+        <w:numPr>
+          <w:ilvl w:val="1"/>
+          <w:numId w:val="1017"/>
+        </w:numPr>
+      </w:pPr>
       <w:r>
         <w:t xml:space="preserve">Dobson and Barnett [2]</w:t>
       </w:r>
       <w:r>
         <w:t xml:space="preserve"> </w:t>
       </w:r>
-      <w:hyperlink r:id="rId148">
+      <w:hyperlink r:id="rId152">
         <w:r>
           <w:rPr>
             <w:rStyle w:val="Hyperlink"/>
@@ -33076,7 +33238,7 @@
         <w:pStyle w:val="Compact"/>
         <w:numPr>
           <w:ilvl w:val="1"/>
-          <w:numId w:val="1016"/>
+          <w:numId w:val="1017"/>
         </w:numPr>
       </w:pPr>
       <w:r>
@@ -33085,7 +33247,7 @@
       <w:r>
         <w:t xml:space="preserve"> </w:t>
       </w:r>
-      <w:hyperlink r:id="rId149">
+      <w:hyperlink r:id="rId153">
         <w:r>
           <w:rPr>
             <w:rStyle w:val="Hyperlink"/>
@@ -33099,7 +33261,7 @@
         <w:pStyle w:val="Compact"/>
         <w:numPr>
           <w:ilvl w:val="1"/>
-          <w:numId w:val="1016"/>
+          <w:numId w:val="1017"/>
         </w:numPr>
       </w:pPr>
       <w:r>
@@ -33111,7 +33273,7 @@
         <w:pStyle w:val="Compact"/>
         <w:numPr>
           <w:ilvl w:val="1"/>
-          <w:numId w:val="1016"/>
+          <w:numId w:val="1017"/>
         </w:numPr>
       </w:pPr>
       <w:r>
@@ -33123,7 +33285,7 @@
         <w:pStyle w:val="Compact"/>
         <w:numPr>
           <w:ilvl w:val="2"/>
-          <w:numId w:val="1017"/>
+          <w:numId w:val="1018"/>
         </w:numPr>
       </w:pPr>
       <w:r>
@@ -33146,7 +33308,7 @@
         <w:pStyle w:val="Compact"/>
         <w:numPr>
           <w:ilvl w:val="1"/>
-          <w:numId w:val="1016"/>
+          <w:numId w:val="1017"/>
         </w:numPr>
       </w:pPr>
       <w:r>
@@ -33158,7 +33320,7 @@
         <w:pStyle w:val="Compact"/>
         <w:numPr>
           <w:ilvl w:val="1"/>
-          <w:numId w:val="1016"/>
+          <w:numId w:val="1017"/>
         </w:numPr>
       </w:pPr>
       <w:r>
@@ -33170,7 +33332,7 @@
         <w:pStyle w:val="Compact"/>
         <w:numPr>
           <w:ilvl w:val="1"/>
-          <w:numId w:val="1016"/>
+          <w:numId w:val="1017"/>
         </w:numPr>
       </w:pPr>
       <w:r>
@@ -33182,7 +33344,7 @@
         <w:pStyle w:val="Compact"/>
         <w:numPr>
           <w:ilvl w:val="1"/>
-          <w:numId w:val="1016"/>
+          <w:numId w:val="1017"/>
         </w:numPr>
       </w:pPr>
       <w:r>
@@ -33194,7 +33356,7 @@
         <w:pStyle w:val="Compact"/>
         <w:numPr>
           <w:ilvl w:val="1"/>
-          <w:numId w:val="1016"/>
+          <w:numId w:val="1017"/>
         </w:numPr>
       </w:pPr>
       <w:r>
@@ -33206,7 +33368,7 @@
         <w:pStyle w:val="Compact"/>
         <w:numPr>
           <w:ilvl w:val="1"/>
-          <w:numId w:val="1016"/>
+          <w:numId w:val="1017"/>
         </w:numPr>
       </w:pPr>
       <w:r>
@@ -33218,7 +33380,7 @@
         <w:pStyle w:val="Compact"/>
         <w:numPr>
           <w:ilvl w:val="1"/>
-          <w:numId w:val="1016"/>
+          <w:numId w:val="1017"/>
         </w:numPr>
       </w:pPr>
       <w:r>
@@ -33230,7 +33392,7 @@
         <w:pStyle w:val="Compact"/>
         <w:numPr>
           <w:ilvl w:val="1"/>
-          <w:numId w:val="1016"/>
+          <w:numId w:val="1017"/>
         </w:numPr>
       </w:pPr>
       <w:r>
@@ -33242,7 +33404,7 @@
         <w:pStyle w:val="Compact"/>
         <w:numPr>
           <w:ilvl w:val="1"/>
-          <w:numId w:val="1016"/>
+          <w:numId w:val="1017"/>
         </w:numPr>
       </w:pPr>
       <w:r>
@@ -33254,7 +33416,7 @@
         <w:pStyle w:val="Compact"/>
         <w:numPr>
           <w:ilvl w:val="1"/>
-          <w:numId w:val="1016"/>
+          <w:numId w:val="1017"/>
         </w:numPr>
       </w:pPr>
       <w:r>
@@ -33266,7 +33428,7 @@
         <w:pStyle w:val="Compact"/>
         <w:numPr>
           <w:ilvl w:val="1"/>
-          <w:numId w:val="1016"/>
+          <w:numId w:val="1017"/>
         </w:numPr>
       </w:pPr>
       <w:r>
@@ -33278,7 +33440,7 @@
         <w:pStyle w:val="Compact"/>
         <w:numPr>
           <w:ilvl w:val="1"/>
-          <w:numId w:val="1016"/>
+          <w:numId w:val="1017"/>
         </w:numPr>
       </w:pPr>
       <w:r>
@@ -33290,7 +33452,7 @@
         <w:pStyle w:val="Compact"/>
         <w:numPr>
           <w:ilvl w:val="1"/>
-          <w:numId w:val="1016"/>
+          <w:numId w:val="1017"/>
         </w:numPr>
       </w:pPr>
       <w:r>
@@ -33302,15 +33464,15 @@
         <w:pStyle w:val="Compact"/>
         <w:numPr>
           <w:ilvl w:val="2"/>
-          <w:numId w:val="1018"/>
+          <w:numId w:val="1019"/>
         </w:numPr>
       </w:pPr>
       <w:r>
         <w:t xml:space="preserve">by UC Berkeley professors</w:t>
       </w:r>
     </w:p>
-    <w:bookmarkEnd w:id="150"/>
-    <w:bookmarkStart w:id="188" w:name="references"/>
+    <w:bookmarkEnd w:id="154"/>
+    <w:bookmarkStart w:id="191" w:name="references"/>
     <w:p>
       <w:pPr>
         <w:pStyle w:val="Heading1"/>
@@ -33319,8 +33481,8 @@
         <w:t xml:space="preserve">References</w:t>
       </w:r>
     </w:p>
-    <w:bookmarkStart w:id="187" w:name="refs"/>
-    <w:bookmarkStart w:id="151" w:name="ref-rocke2021epi204"/>
+    <w:bookmarkStart w:id="190" w:name="refs"/>
+    <w:bookmarkStart w:id="155" w:name="ref-rocke2021epi204"/>
     <w:p>
       <w:pPr>
         <w:pStyle w:val="Bibliography"/>
@@ -33382,8 +33544,8 @@
         </w:r>
       </w:hyperlink>
     </w:p>
-    <w:bookmarkEnd w:id="151"/>
-    <w:bookmarkStart w:id="153" w:name="ref-dobson4e"/>
+    <w:bookmarkEnd w:id="155"/>
+    <w:bookmarkStart w:id="157" w:name="ref-dobson4e"/>
     <w:p>
       <w:pPr>
         <w:pStyle w:val="Bibliography"/>
@@ -33416,7 +33578,7 @@
       <w:r>
         <w:t xml:space="preserve"> </w:t>
       </w:r>
-      <w:hyperlink r:id="rId152">
+      <w:hyperlink r:id="rId156">
         <w:r>
           <w:rPr>
             <w:rStyle w:val="Hyperlink"/>
@@ -33425,8 +33587,8 @@
         </w:r>
       </w:hyperlink>
     </w:p>
-    <w:bookmarkEnd w:id="153"/>
-    <w:bookmarkStart w:id="155" w:name="ref-bates2015lme4"/>
+    <w:bookmarkEnd w:id="157"/>
+    <w:bookmarkStart w:id="159" w:name="ref-bates2015lme4"/>
     <w:p>
       <w:pPr>
         <w:pStyle w:val="Bibliography"/>
@@ -33474,7 +33636,7 @@
       <w:r>
         <w:t xml:space="preserve"> </w:t>
       </w:r>
-      <w:hyperlink r:id="rId154">
+      <w:hyperlink r:id="rId158">
         <w:r>
           <w:rPr>
             <w:rStyle w:val="Hyperlink"/>
@@ -33486,8 +33648,8 @@
         <w:t xml:space="preserve">.</w:t>
       </w:r>
     </w:p>
-    <w:bookmarkEnd w:id="155"/>
-    <w:bookmarkStart w:id="157" w:name="ref-venables2002modern"/>
+    <w:bookmarkEnd w:id="159"/>
+    <w:bookmarkStart w:id="161" w:name="ref-venables2002modern"/>
     <w:p>
       <w:pPr>
         <w:pStyle w:val="Bibliography"/>
@@ -33534,7 +33696,7 @@
       <w:r>
         <w:t xml:space="preserve"> </w:t>
       </w:r>
-      <w:hyperlink r:id="rId156">
+      <w:hyperlink r:id="rId160">
         <w:r>
           <w:rPr>
             <w:rStyle w:val="Hyperlink"/>
@@ -33546,8 +33708,8 @@
         <w:t xml:space="preserve">.</w:t>
       </w:r>
     </w:p>
-    <w:bookmarkEnd w:id="157"/>
-    <w:bookmarkStart w:id="159" w:name="ref-mcelreath2026rethinking"/>
+    <w:bookmarkEnd w:id="161"/>
+    <w:bookmarkStart w:id="163" w:name="ref-mcelreath2026rethinking"/>
     <w:p>
       <w:pPr>
         <w:pStyle w:val="Bibliography"/>
@@ -33579,7 +33741,7 @@
       <w:r>
         <w:t xml:space="preserve"> </w:t>
       </w:r>
-      <w:hyperlink r:id="rId158">
+      <w:hyperlink r:id="rId162">
         <w:r>
           <w:rPr>
             <w:rStyle w:val="Hyperlink"/>
@@ -33588,8 +33750,8 @@
         </w:r>
       </w:hyperlink>
     </w:p>
-    <w:bookmarkEnd w:id="159"/>
-    <w:bookmarkStart w:id="160" w:name="ref-gelman2006data"/>
+    <w:bookmarkEnd w:id="163"/>
+    <w:bookmarkStart w:id="164" w:name="ref-gelman2006data"/>
     <w:p>
       <w:pPr>
         <w:pStyle w:val="Bibliography"/>
@@ -33620,8 +33782,8 @@
         <w:t xml:space="preserve">. in Analytical methods for social research. Cambridge, MA: Cambridge University Press, 2007.</w:t>
       </w:r>
     </w:p>
-    <w:bookmarkEnd w:id="160"/>
-    <w:bookmarkStart w:id="162" w:name="ref-goodrich2024rstanarm"/>
+    <w:bookmarkEnd w:id="164"/>
+    <w:bookmarkStart w:id="165" w:name="ref-goodrich2024rstanarm"/>
     <w:p>
       <w:pPr>
         <w:pStyle w:val="Bibliography"/>
@@ -33703,7 +33865,7 @@
       <w:r>
         <w:t xml:space="preserve"> </w:t>
       </w:r>
-      <w:hyperlink r:id="rId161">
+      <w:hyperlink r:id="rId150">
         <w:r>
           <w:rPr>
             <w:rStyle w:val="Hyperlink"/>
@@ -33712,8 +33874,8 @@
         </w:r>
       </w:hyperlink>
     </w:p>
-    <w:bookmarkEnd w:id="162"/>
-    <w:bookmarkStart w:id="164" w:name="ref-vittinghoff2e"/>
+    <w:bookmarkEnd w:id="165"/>
+    <w:bookmarkStart w:id="167" w:name="ref-vittinghoff2e"/>
     <w:p>
       <w:pPr>
         <w:pStyle w:val="Bibliography"/>
@@ -33746,7 +33908,7 @@
       <w:r>
         <w:t xml:space="preserve"> </w:t>
       </w:r>
-      <w:hyperlink r:id="rId163">
+      <w:hyperlink r:id="rId166">
         <w:r>
           <w:rPr>
             <w:rStyle w:val="Hyperlink"/>
@@ -33755,8 +33917,8 @@
         </w:r>
       </w:hyperlink>
     </w:p>
-    <w:bookmarkEnd w:id="164"/>
-    <w:bookmarkStart w:id="166" w:name="ref-jiming2021"/>
+    <w:bookmarkEnd w:id="167"/>
+    <w:bookmarkStart w:id="169" w:name="ref-jiming2021"/>
     <w:p>
       <w:pPr>
         <w:pStyle w:val="Bibliography"/>
@@ -33789,7 +33951,7 @@
       <w:r>
         <w:t xml:space="preserve"> </w:t>
       </w:r>
-      <w:hyperlink r:id="rId165">
+      <w:hyperlink r:id="rId168">
         <w:r>
           <w:rPr>
             <w:rStyle w:val="Hyperlink"/>
@@ -33801,8 +33963,8 @@
         <w:t xml:space="preserve">.</w:t>
       </w:r>
     </w:p>
-    <w:bookmarkEnd w:id="166"/>
-    <w:bookmarkStart w:id="168" w:name="ref-faraway2016extending"/>
+    <w:bookmarkEnd w:id="169"/>
+    <w:bookmarkStart w:id="171" w:name="ref-faraway2016extending"/>
     <w:p>
       <w:pPr>
         <w:pStyle w:val="Bibliography"/>
@@ -33835,7 +33997,7 @@
       <w:r>
         <w:t xml:space="preserve"> </w:t>
       </w:r>
-      <w:hyperlink r:id="rId167">
+      <w:hyperlink r:id="rId170">
         <w:r>
           <w:rPr>
             <w:rStyle w:val="Hyperlink"/>
@@ -33847,8 +34009,8 @@
         <w:t xml:space="preserve">.</w:t>
       </w:r>
     </w:p>
-    <w:bookmarkEnd w:id="168"/>
-    <w:bookmarkStart w:id="169" w:name="ref-mcculloch2008generalized"/>
+    <w:bookmarkEnd w:id="171"/>
+    <w:bookmarkStart w:id="172" w:name="ref-mcculloch2008generalized"/>
     <w:p>
       <w:pPr>
         <w:pStyle w:val="Bibliography"/>
@@ -33879,8 +34041,8 @@
         <w:t xml:space="preserve">, 2nd ed., vol. 651. John Wiley &amp; Sons, 2008.</w:t>
       </w:r>
     </w:p>
-    <w:bookmarkEnd w:id="169"/>
-    <w:bookmarkStart w:id="170" w:name="ref-hedeker2006"/>
+    <w:bookmarkEnd w:id="172"/>
+    <w:bookmarkStart w:id="173" w:name="ref-hedeker2006"/>
     <w:p>
       <w:pPr>
         <w:pStyle w:val="Bibliography"/>
@@ -33911,8 +34073,8 @@
         <w:t xml:space="preserve">. in Wiley series in probability and statistics. Hoboken, N.J: Wiley-Interscience, 2006.</w:t>
       </w:r>
     </w:p>
-    <w:bookmarkEnd w:id="170"/>
-    <w:bookmarkStart w:id="171" w:name="ref-wakefield2013"/>
+    <w:bookmarkEnd w:id="173"/>
+    <w:bookmarkStart w:id="174" w:name="ref-wakefield2013"/>
     <w:p>
       <w:pPr>
         <w:pStyle w:val="Bibliography"/>
@@ -33943,8 +34105,8 @@
         <w:t xml:space="preserve">, 1st ed. 2013. in Springer series in statistics. New York, NY: Springer New York, 2013.</w:t>
       </w:r>
     </w:p>
-    <w:bookmarkEnd w:id="171"/>
-    <w:bookmarkStart w:id="172" w:name="ref-zuur2009"/>
+    <w:bookmarkEnd w:id="174"/>
+    <w:bookmarkStart w:id="175" w:name="ref-zuur2009"/>
     <w:p>
       <w:pPr>
         <w:pStyle w:val="Bibliography"/>
@@ -33975,8 +34137,8 @@
         <w:t xml:space="preserve">. in Statistics for biology and health. New York ; Springer, 2009.</w:t>
       </w:r>
     </w:p>
-    <w:bookmarkEnd w:id="172"/>
-    <w:bookmarkStart w:id="173" w:name="ref-DigglePeter2013AoLD"/>
+    <w:bookmarkEnd w:id="175"/>
+    <w:bookmarkStart w:id="176" w:name="ref-DigglePeter2013AoLD"/>
     <w:p>
       <w:pPr>
         <w:pStyle w:val="Bibliography"/>
@@ -34007,8 +34169,8 @@
         <w:t xml:space="preserve">, Second edition., vol. 25. in Oxford statistical science series, vol. 25. United Kingdom: Oxford University Press, 2013, pp. xv–xv.</w:t>
       </w:r>
     </w:p>
-    <w:bookmarkEnd w:id="173"/>
-    <w:bookmarkStart w:id="175" w:name="ref-fitzmaurice2012"/>
+    <w:bookmarkEnd w:id="176"/>
+    <w:bookmarkStart w:id="178" w:name="ref-fitzmaurice2012"/>
     <w:p>
       <w:pPr>
         <w:pStyle w:val="Bibliography"/>
@@ -34041,7 +34203,7 @@
       <w:r>
         <w:t xml:space="preserve"> </w:t>
       </w:r>
-      <w:hyperlink r:id="rId174">
+      <w:hyperlink r:id="rId177">
         <w:r>
           <w:rPr>
             <w:rStyle w:val="Hyperlink"/>
@@ -34053,8 +34215,8 @@
         <w:t xml:space="preserve">.</w:t>
       </w:r>
     </w:p>
-    <w:bookmarkEnd w:id="175"/>
-    <w:bookmarkStart w:id="177" w:name="ref-fitzmaurice2009"/>
+    <w:bookmarkEnd w:id="178"/>
+    <w:bookmarkStart w:id="180" w:name="ref-fitzmaurice2009"/>
     <w:p>
       <w:pPr>
         <w:pStyle w:val="Bibliography"/>
@@ -34087,7 +34249,7 @@
       <w:r>
         <w:t xml:space="preserve"> </w:t>
       </w:r>
-      <w:hyperlink r:id="rId176">
+      <w:hyperlink r:id="rId179">
         <w:r>
           <w:rPr>
             <w:rStyle w:val="Hyperlink"/>
@@ -34099,8 +34261,8 @@
         <w:t xml:space="preserve">.</w:t>
       </w:r>
     </w:p>
-    <w:bookmarkEnd w:id="177"/>
-    <w:bookmarkStart w:id="179" w:name="ref-galecki2013"/>
+    <w:bookmarkEnd w:id="180"/>
+    <w:bookmarkStart w:id="182" w:name="ref-galecki2013"/>
     <w:p>
       <w:pPr>
         <w:pStyle w:val="Bibliography"/>
@@ -34161,7 +34323,7 @@
       <w:r>
         <w:t xml:space="preserve"> </w:t>
       </w:r>
-      <w:hyperlink r:id="rId178">
+      <w:hyperlink r:id="rId181">
         <w:r>
           <w:rPr>
             <w:rStyle w:val="Hyperlink"/>
@@ -34173,8 +34335,8 @@
         <w:t xml:space="preserve">.</w:t>
       </w:r>
     </w:p>
-    <w:bookmarkEnd w:id="179"/>
-    <w:bookmarkStart w:id="180" w:name="ref-congdon2020"/>
+    <w:bookmarkEnd w:id="182"/>
+    <w:bookmarkStart w:id="183" w:name="ref-congdon2020"/>
     <w:p>
       <w:pPr>
         <w:pStyle w:val="Bibliography"/>
@@ -34226,8 +34388,8 @@
         <w:t xml:space="preserve">, 2nd edition. Milton: CRC Press, 2020.</w:t>
       </w:r>
     </w:p>
-    <w:bookmarkEnd w:id="180"/>
-    <w:bookmarkStart w:id="182" w:name="ref-molenberghs2005"/>
+    <w:bookmarkEnd w:id="183"/>
+    <w:bookmarkStart w:id="185" w:name="ref-molenberghs2005"/>
     <w:p>
       <w:pPr>
         <w:pStyle w:val="Bibliography"/>
@@ -34260,7 +34422,7 @@
       <w:r>
         <w:t xml:space="preserve"> </w:t>
       </w:r>
-      <w:hyperlink r:id="rId181">
+      <w:hyperlink r:id="rId184">
         <w:r>
           <w:rPr>
             <w:rStyle w:val="Hyperlink"/>
@@ -34272,8 +34434,8 @@
         <w:t xml:space="preserve">.</w:t>
       </w:r>
     </w:p>
-    <w:bookmarkEnd w:id="182"/>
-    <w:bookmarkStart w:id="184" w:name="ref-VerbekeGeert2000LMMf"/>
+    <w:bookmarkEnd w:id="185"/>
+    <w:bookmarkStart w:id="187" w:name="ref-VerbekeGeert2000LMMf"/>
     <w:p>
       <w:pPr>
         <w:pStyle w:val="Bibliography"/>
@@ -34306,7 +34468,7 @@
       <w:r>
         <w:t xml:space="preserve"> </w:t>
       </w:r>
-      <w:hyperlink r:id="rId183">
+      <w:hyperlink r:id="rId186">
         <w:r>
           <w:rPr>
             <w:rStyle w:val="Hyperlink"/>
@@ -34318,8 +34480,8 @@
         <w:t xml:space="preserve">.</w:t>
       </w:r>
     </w:p>
-    <w:bookmarkEnd w:id="184"/>
-    <w:bookmarkStart w:id="186" w:name="ref-jewell2016analysis"/>
+    <w:bookmarkEnd w:id="187"/>
+    <w:bookmarkStart w:id="189" w:name="ref-jewell2016analysis"/>
     <w:p>
       <w:pPr>
         <w:pStyle w:val="Bibliography"/>
@@ -34352,7 +34514,7 @@
       <w:r>
         <w:t xml:space="preserve"> </w:t>
       </w:r>
-      <w:hyperlink r:id="rId185">
+      <w:hyperlink r:id="rId188">
         <w:r>
           <w:rPr>
             <w:rStyle w:val="Hyperlink"/>
@@ -34361,9 +34523,9 @@
         </w:r>
       </w:hyperlink>
     </w:p>
-    <w:bookmarkEnd w:id="186"/>
-    <w:bookmarkEnd w:id="187"/>
-    <w:bookmarkEnd w:id="188"/>
+    <w:bookmarkEnd w:id="189"/>
+    <w:bookmarkEnd w:id="190"/>
+    <w:bookmarkEnd w:id="191"/>
     <w:sectPr>
       <w:footnotePr>
         <w:numRestart w:val="eachSect"/>
@@ -34632,6 +34794,9 @@
     <w:abstractNumId w:val="991"/>
   </w:num>
   <w:num w:numId="1018">
+    <w:abstractNumId w:val="991"/>
+  </w:num>
+  <w:num w:numId="1019">
     <w:abstractNumId w:val="991"/>
   </w:num>
 </w:numbering>

</xml_diff>